<commit_message>
docs: actualizar entregables E01-E04
</commit_message>
<xml_diff>
--- a/Entregables_pt_app/01_repo_inicial/README.docx
+++ b/Entregables_pt_app/01_repo_inicial/README.docx
@@ -2,213 +2,13 @@
 <file path=word/document.xml><?xml version="1.0" encoding="utf-8"?>
 <w:document xmlns:w="http://schemas.openxmlformats.org/wordprocessingml/2006/main" xmlns:m="http://schemas.openxmlformats.org/officeDocument/2006/math" xmlns:r="http://schemas.openxmlformats.org/officeDocument/2006/relationships" xmlns:o="urn:schemas-microsoft-com:office:office" xmlns:v="urn:schemas-microsoft-com:vml" xmlns:w10="urn:schemas-microsoft-com:office:word" xmlns:a="http://schemas.openxmlformats.org/drawingml/2006/main" xmlns:pic="http://schemas.openxmlformats.org/drawingml/2006/picture" xmlns:wp="http://schemas.openxmlformats.org/drawingml/2006/wordprocessingDrawing">
   <w:body>
-    <w:bookmarkStart w:id="15" w:name="X8da92f52e856e8a966027ddc0fce2a326976405"/>
+    <w:bookmarkStart w:id="19" w:name="X574ff1d21a56072aa8175455e15912281c68542"/>
     <w:p>
       <w:pPr>
         <w:pStyle w:val="Heading1"/>
       </w:pPr>
       <w:r>
-        <w:t xml:space="preserve">Entregable 01 - Repositorio de Código y Scripts Iniciales</w:t>
-      </w:r>
-    </w:p>
-    <w:p>
-      <w:pPr>
-        <w:pStyle w:val="FirstParagraph"/>
-      </w:pPr>
-      <w:r>
-        <w:rPr>
-          <w:b/>
-          <w:bCs/>
-        </w:rPr>
-        <w:t xml:space="preserve">Fase:</w:t>
-      </w:r>
-      <w:r>
-        <w:t xml:space="preserve"> </w:t>
-      </w:r>
-      <w:r>
-        <w:t xml:space="preserve">1 - Fundación</w:t>
-      </w:r>
-      <w:r>
-        <w:br/>
-      </w:r>
-      <w:r>
-        <w:rPr>
-          <w:b/>
-          <w:bCs/>
-        </w:rPr>
-        <w:t xml:space="preserve">Fecha de creación:</w:t>
-      </w:r>
-      <w:r>
-        <w:t xml:space="preserve"> </w:t>
-      </w:r>
-      <w:r>
-        <w:t xml:space="preserve">2026-01-24</w:t>
-      </w:r>
-      <w:r>
-        <w:br/>
-      </w:r>
-      <w:r>
-        <w:rPr>
-          <w:b/>
-          <w:bCs/>
-        </w:rPr>
-        <w:t xml:space="preserve">Estado:</w:t>
-      </w:r>
-      <w:r>
-        <w:t xml:space="preserve"> </w:t>
-      </w:r>
-      <w:r>
-        <w:t xml:space="preserve">Completado</w:t>
-      </w:r>
-    </w:p>
-    <w:bookmarkStart w:id="9" w:name="objetivo"/>
-    <w:p>
-      <w:pPr>
-        <w:pStyle w:val="Heading2"/>
-      </w:pPr>
-      <w:r>
-        <w:t xml:space="preserve">Objetivo</w:t>
-      </w:r>
-    </w:p>
-    <w:p>
-      <w:pPr>
-        <w:pStyle w:val="FirstParagraph"/>
-      </w:pPr>
-      <w:r>
-        <w:t xml:space="preserve">Crear snapshot del código original como línea base del proyecto. Este entregable establece el punto de partida antes de realizar modificaciones.</w:t>
-      </w:r>
-    </w:p>
-    <w:bookmarkEnd w:id="9"/>
-    <w:bookmarkStart w:id="10" w:name="descripción"/>
-    <w:p>
-      <w:pPr>
-        <w:pStyle w:val="Heading2"/>
-      </w:pPr>
-      <w:r>
-        <w:t xml:space="preserve">Descripción</w:t>
-      </w:r>
-    </w:p>
-    <w:p>
-      <w:pPr>
-        <w:pStyle w:val="FirstParagraph"/>
-      </w:pPr>
-      <w:r>
-        <w:t xml:space="preserve">Este entregable contiene copias exactas de:</w:t>
-      </w:r>
-      <w:r>
-        <w:t xml:space="preserve"> </w:t>
-      </w:r>
-      <w:r>
-        <w:t xml:space="preserve">- La aplicación Shiny principal (</w:t>
-      </w:r>
-      <w:r>
-        <w:rPr>
-          <w:rStyle w:val="VerbatimChar"/>
-        </w:rPr>
-        <w:t xml:space="preserve">app_original.R</w:t>
-      </w:r>
-      <w:r>
-        <w:t xml:space="preserve">)</w:t>
-      </w:r>
-      <w:r>
-        <w:t xml:space="preserve"> </w:t>
-      </w:r>
-      <w:r>
-        <w:t xml:space="preserve">- Las cuatro funciones principales de cálculo:</w:t>
-      </w:r>
-      <w:r>
-        <w:t xml:space="preserve"> </w:t>
-      </w:r>
-      <w:r>
-        <w:t xml:space="preserve">-</w:t>
-      </w:r>
-      <w:r>
-        <w:t xml:space="preserve"> </w:t>
-      </w:r>
-      <w:r>
-        <w:rPr>
-          <w:rStyle w:val="VerbatimChar"/>
-        </w:rPr>
-        <w:t xml:space="preserve">pt_homogeneity.R</w:t>
-      </w:r>
-      <w:r>
-        <w:t xml:space="preserve"> </w:t>
-      </w:r>
-      <w:r>
-        <w:t xml:space="preserve">- Cálculos de homogeneidad</w:t>
-      </w:r>
-      <w:r>
-        <w:t xml:space="preserve"> </w:t>
-      </w:r>
-      <w:r>
-        <w:t xml:space="preserve">-</w:t>
-      </w:r>
-      <w:r>
-        <w:t xml:space="preserve"> </w:t>
-      </w:r>
-      <w:r>
-        <w:rPr>
-          <w:rStyle w:val="VerbatimChar"/>
-        </w:rPr>
-        <w:t xml:space="preserve">pt_robust_stats.R</w:t>
-      </w:r>
-      <w:r>
-        <w:t xml:space="preserve"> </w:t>
-      </w:r>
-      <w:r>
-        <w:t xml:space="preserve">- Estadísticos robustos</w:t>
-      </w:r>
-      <w:r>
-        <w:t xml:space="preserve"> </w:t>
-      </w:r>
-      <w:r>
-        <w:t xml:space="preserve">-</w:t>
-      </w:r>
-      <w:r>
-        <w:t xml:space="preserve"> </w:t>
-      </w:r>
-      <w:r>
-        <w:rPr>
-          <w:rStyle w:val="VerbatimChar"/>
-        </w:rPr>
-        <w:t xml:space="preserve">pt_scores.R</w:t>
-      </w:r>
-      <w:r>
-        <w:t xml:space="preserve"> </w:t>
-      </w:r>
-      <w:r>
-        <w:t xml:space="preserve">- Cálculo de puntajes PT</w:t>
-      </w:r>
-      <w:r>
-        <w:t xml:space="preserve"> </w:t>
-      </w:r>
-      <w:r>
-        <w:t xml:space="preserve">-</w:t>
-      </w:r>
-      <w:r>
-        <w:t xml:space="preserve"> </w:t>
-      </w:r>
-      <w:r>
-        <w:rPr>
-          <w:rStyle w:val="VerbatimChar"/>
-        </w:rPr>
-        <w:t xml:space="preserve">utils.R</w:t>
-      </w:r>
-      <w:r>
-        <w:t xml:space="preserve"> </w:t>
-      </w:r>
-      <w:r>
-        <w:t xml:space="preserve">- Funciones utilitarias</w:t>
-      </w:r>
-    </w:p>
-    <w:bookmarkEnd w:id="10"/>
-    <w:bookmarkStart w:id="11" w:name="archivos-incluidos"/>
-    <w:p>
-      <w:pPr>
-        <w:pStyle w:val="Heading2"/>
-      </w:pPr>
-      <w:r>
-        <w:t xml:space="preserve">Archivos Incluidos</w:t>
+        <w:t xml:space="preserve">Entregable 01 — Repositorio inicial recibido</w:t>
       </w:r>
     </w:p>
     <w:tbl>
@@ -219,8 +19,287 @@
         <w:tblLook w:firstRow="1" w:lastRow="0" w:firstColumn="0" w:lastColumn="0" w:noHBand="0" w:noVBand="0" w:val="0020"/>
       </w:tblPr>
       <w:tblGrid>
-        <w:gridCol w:w="2160"/>
-        <w:gridCol w:w="3120"/>
+        <w:gridCol w:w="3960"/>
+        <w:gridCol w:w="3960"/>
+      </w:tblGrid>
+      <w:tr>
+        <w:trPr>
+          <w:tblHeader w:val="on"/>
+        </w:trPr>
+        <w:tc>
+          <w:tcPr/>
+          <w:p>
+            <w:pPr>
+              <w:pStyle w:val="Compact"/>
+            </w:pPr>
+            <w:r>
+              <w:t xml:space="preserve">Campo</w:t>
+            </w:r>
+          </w:p>
+        </w:tc>
+        <w:tc>
+          <w:tcPr/>
+          <w:p>
+            <w:pPr>
+              <w:pStyle w:val="Compact"/>
+            </w:pPr>
+            <w:r>
+              <w:t xml:space="preserve">Valor</w:t>
+            </w:r>
+          </w:p>
+        </w:tc>
+      </w:tr>
+      <w:tr>
+        <w:tc>
+          <w:tcPr/>
+          <w:p>
+            <w:pPr>
+              <w:pStyle w:val="Compact"/>
+            </w:pPr>
+            <w:r>
+              <w:t xml:space="preserve">Código</w:t>
+            </w:r>
+          </w:p>
+        </w:tc>
+        <w:tc>
+          <w:tcPr/>
+          <w:p>
+            <w:pPr>
+              <w:pStyle w:val="Compact"/>
+            </w:pPr>
+            <w:r>
+              <w:t xml:space="preserve">E01</w:t>
+            </w:r>
+          </w:p>
+        </w:tc>
+      </w:tr>
+      <w:tr>
+        <w:tc>
+          <w:tcPr/>
+          <w:p>
+            <w:pPr>
+              <w:pStyle w:val="Compact"/>
+            </w:pPr>
+            <w:r>
+              <w:t xml:space="preserve">Versión documental</w:t>
+            </w:r>
+          </w:p>
+        </w:tc>
+        <w:tc>
+          <w:tcPr/>
+          <w:p>
+            <w:pPr>
+              <w:pStyle w:val="Compact"/>
+            </w:pPr>
+            <w:r>
+              <w:t xml:space="preserve">2.0</w:t>
+            </w:r>
+          </w:p>
+        </w:tc>
+      </w:tr>
+      <w:tr>
+        <w:tc>
+          <w:tcPr/>
+          <w:p>
+            <w:pPr>
+              <w:pStyle w:val="Compact"/>
+            </w:pPr>
+            <w:r>
+              <w:t xml:space="preserve">Fecha de actualización</w:t>
+            </w:r>
+          </w:p>
+        </w:tc>
+        <w:tc>
+          <w:tcPr/>
+          <w:p>
+            <w:pPr>
+              <w:pStyle w:val="Compact"/>
+            </w:pPr>
+            <w:r>
+              <w:t xml:space="preserve">2026-07-14</w:t>
+            </w:r>
+          </w:p>
+        </w:tc>
+      </w:tr>
+      <w:tr>
+        <w:tc>
+          <w:tcPr/>
+          <w:p>
+            <w:pPr>
+              <w:pStyle w:val="Compact"/>
+            </w:pPr>
+            <w:r>
+              <w:t xml:space="preserve">Estado</w:t>
+            </w:r>
+          </w:p>
+        </w:tc>
+        <w:tc>
+          <w:tcPr/>
+          <w:p>
+            <w:pPr>
+              <w:pStyle w:val="Compact"/>
+            </w:pPr>
+            <w:r>
+              <w:t xml:space="preserve">Vigente como registro histórico; no es el código operativo actual</w:t>
+            </w:r>
+          </w:p>
+        </w:tc>
+      </w:tr>
+      <w:tr>
+        <w:tc>
+          <w:tcPr/>
+          <w:p>
+            <w:pPr>
+              <w:pStyle w:val="Compact"/>
+            </w:pPr>
+            <w:r>
+              <w:t xml:space="preserve">Fuente funcional vigente</w:t>
+            </w:r>
+          </w:p>
+        </w:tc>
+        <w:tc>
+          <w:tcPr/>
+          <w:p>
+            <w:pPr>
+              <w:pStyle w:val="Compact"/>
+            </w:pPr>
+            <w:r>
+              <w:rPr>
+                <w:rStyle w:val="VerbatimChar"/>
+              </w:rPr>
+              <w:t xml:space="preserve">app.R</w:t>
+            </w:r>
+            <w:r>
+              <w:t xml:space="preserve">,</w:t>
+            </w:r>
+            <w:r>
+              <w:t xml:space="preserve"> </w:t>
+            </w:r>
+            <w:r>
+              <w:rPr>
+                <w:rStyle w:val="VerbatimChar"/>
+              </w:rPr>
+              <w:t xml:space="preserve">R/</w:t>
+            </w:r>
+            <w:r>
+              <w:t xml:space="preserve"> </w:t>
+            </w:r>
+            <w:r>
+              <w:t xml:space="preserve">y</w:t>
+            </w:r>
+            <w:r>
+              <w:t xml:space="preserve"> </w:t>
+            </w:r>
+            <w:r>
+              <w:rPr>
+                <w:rStyle w:val="VerbatimChar"/>
+              </w:rPr>
+              <w:t xml:space="preserve">ptcalc/R/</w:t>
+            </w:r>
+            <w:r>
+              <w:t xml:space="preserve"> </w:t>
+            </w:r>
+            <w:r>
+              <w:t xml:space="preserve">en la raíz del repositorio</w:t>
+            </w:r>
+          </w:p>
+        </w:tc>
+      </w:tr>
+      <w:tr>
+        <w:tc>
+          <w:tcPr/>
+          <w:p>
+            <w:pPr>
+              <w:pStyle w:val="Compact"/>
+            </w:pPr>
+            <w:r>
+              <w:t xml:space="preserve">Aprobación externa</w:t>
+            </w:r>
+          </w:p>
+        </w:tc>
+        <w:tc>
+          <w:tcPr/>
+          <w:p>
+            <w:pPr>
+              <w:pStyle w:val="Compact"/>
+            </w:pPr>
+            <w:r>
+              <w:t xml:space="preserve">Pendiente</w:t>
+            </w:r>
+          </w:p>
+        </w:tc>
+      </w:tr>
+    </w:tbl>
+    <w:bookmarkStart w:id="9" w:name="para-qué-sirve-este-entregable"/>
+    <w:p>
+      <w:pPr>
+        <w:pStyle w:val="Heading2"/>
+      </w:pPr>
+      <w:r>
+        <w:t xml:space="preserve">Para qué sirve este entregable</w:t>
+      </w:r>
+    </w:p>
+    <w:p>
+      <w:pPr>
+        <w:pStyle w:val="FirstParagraph"/>
+      </w:pPr>
+      <w:r>
+        <w:t xml:space="preserve">Este directorio conserva el código recibido al inicio del desarrollo. Permite</w:t>
+      </w:r>
+      <w:r>
+        <w:t xml:space="preserve"> </w:t>
+      </w:r>
+      <w:r>
+        <w:t xml:space="preserve">reconstruir el punto de partida y comparar la evolución del aplicativo. No debe</w:t>
+      </w:r>
+      <w:r>
+        <w:t xml:space="preserve"> </w:t>
+      </w:r>
+      <w:r>
+        <w:t xml:space="preserve">usarse para iniciar ni mantener la versión actual: la aplicación vigente se</w:t>
+      </w:r>
+      <w:r>
+        <w:t xml:space="preserve"> </w:t>
+      </w:r>
+      <w:r>
+        <w:t xml:space="preserve">ejecuta desde el</w:t>
+      </w:r>
+      <w:r>
+        <w:t xml:space="preserve"> </w:t>
+      </w:r>
+      <w:r>
+        <w:rPr>
+          <w:rStyle w:val="VerbatimChar"/>
+        </w:rPr>
+        <w:t xml:space="preserve">app.R</w:t>
+      </w:r>
+      <w:r>
+        <w:t xml:space="preserve"> </w:t>
+      </w:r>
+      <w:r>
+        <w:t xml:space="preserve">ubicado en la raíz del repositorio.</w:t>
+      </w:r>
+    </w:p>
+    <w:bookmarkEnd w:id="9"/>
+    <w:bookmarkStart w:id="10" w:name="qué-contiene"/>
+    <w:p>
+      <w:pPr>
+        <w:pStyle w:val="Heading2"/>
+      </w:pPr>
+      <w:r>
+        <w:t xml:space="preserve">Qué contiene</w:t>
+      </w:r>
+    </w:p>
+    <w:tbl>
+      <w:tblPr>
+        <w:tblStyle w:val="Table"/>
+        <w:tblW w:type="pct" w:w="5000"/>
+        <w:tblLayout w:type="fixed"/>
+        <w:tblLook w:firstRow="1" w:lastRow="0" w:firstColumn="0" w:lastColumn="0" w:noHBand="0" w:noVBand="0" w:val="0020"/>
+      </w:tblPr>
+      <w:tblGrid>
+        <w:gridCol w:w="2640"/>
+        <w:gridCol w:w="2640"/>
         <w:gridCol w:w="2640"/>
       </w:tblGrid>
       <w:tr>
@@ -245,59 +324,18 @@
               <w:pStyle w:val="Compact"/>
             </w:pPr>
             <w:r>
-              <w:t xml:space="preserve">Descripción</w:t>
-            </w:r>
-          </w:p>
-        </w:tc>
-        <w:tc>
-          <w:tcPr/>
-          <w:p>
-            <w:pPr>
-              <w:pStyle w:val="Compact"/>
-            </w:pPr>
-            <w:r>
-              <w:t xml:space="preserve">Ubicación</w:t>
-            </w:r>
-          </w:p>
-        </w:tc>
-      </w:tr>
-      <w:tr>
-        <w:tc>
-          <w:tcPr/>
-          <w:p>
-            <w:pPr>
-              <w:pStyle w:val="Compact"/>
-            </w:pPr>
-            <w:r>
-              <w:rPr>
-                <w:rStyle w:val="VerbatimChar"/>
-              </w:rPr>
-              <w:t xml:space="preserve">README.md</w:t>
-            </w:r>
-          </w:p>
-        </w:tc>
-        <w:tc>
-          <w:tcPr/>
-          <w:p>
-            <w:pPr>
-              <w:pStyle w:val="Compact"/>
-            </w:pPr>
-            <w:r>
-              <w:t xml:space="preserve">Este documento</w:t>
-            </w:r>
-          </w:p>
-        </w:tc>
-        <w:tc>
-          <w:tcPr/>
-          <w:p>
-            <w:pPr>
-              <w:pStyle w:val="Compact"/>
-            </w:pPr>
-            <w:r>
-              <w:rPr>
-                <w:rStyle w:val="VerbatimChar"/>
-              </w:rPr>
-              <w:t xml:space="preserve">/</w:t>
+              <w:t xml:space="preserve">Función</w:t>
+            </w:r>
+          </w:p>
+        </w:tc>
+        <w:tc>
+          <w:tcPr/>
+          <w:p>
+            <w:pPr>
+              <w:pStyle w:val="Compact"/>
+            </w:pPr>
+            <w:r>
+              <w:t xml:space="preserve">Vigencia</w:t>
             </w:r>
           </w:p>
         </w:tc>
@@ -324,30 +362,18 @@
               <w:pStyle w:val="Compact"/>
             </w:pPr>
             <w:r>
-              <w:t xml:space="preserve">Copia de</w:t>
-            </w:r>
-            <w:r>
-              <w:t xml:space="preserve"> </w:t>
-            </w:r>
-            <w:r>
-              <w:rPr>
-                <w:rStyle w:val="VerbatimChar"/>
-              </w:rPr>
-              <w:t xml:space="preserve">pt_app/app.R</w:t>
-            </w:r>
-          </w:p>
-        </w:tc>
-        <w:tc>
-          <w:tcPr/>
-          <w:p>
-            <w:pPr>
-              <w:pStyle w:val="Compact"/>
-            </w:pPr>
-            <w:r>
-              <w:rPr>
-                <w:rStyle w:val="VerbatimChar"/>
-              </w:rPr>
-              <w:t xml:space="preserve">/</w:t>
+              <w:t xml:space="preserve">Copia de la aplicación en el corte inicial</w:t>
+            </w:r>
+          </w:p>
+        </w:tc>
+        <w:tc>
+          <w:tcPr/>
+          <w:p>
+            <w:pPr>
+              <w:pStyle w:val="Compact"/>
+            </w:pPr>
+            <w:r>
+              <w:t xml:space="preserve">Histórico</w:t>
             </w:r>
           </w:p>
         </w:tc>
@@ -374,21 +400,18 @@
               <w:pStyle w:val="Compact"/>
             </w:pPr>
             <w:r>
-              <w:t xml:space="preserve">Funciones de homogeneidad</w:t>
-            </w:r>
-          </w:p>
-        </w:tc>
-        <w:tc>
-          <w:tcPr/>
-          <w:p>
-            <w:pPr>
-              <w:pStyle w:val="Compact"/>
-            </w:pPr>
-            <w:r>
-              <w:rPr>
-                <w:rStyle w:val="VerbatimChar"/>
-              </w:rPr>
-              <w:t xml:space="preserve">R/</w:t>
+              <w:t xml:space="preserve">Cálculos iniciales de homogeneidad</w:t>
+            </w:r>
+          </w:p>
+        </w:tc>
+        <w:tc>
+          <w:tcPr/>
+          <w:p>
+            <w:pPr>
+              <w:pStyle w:val="Compact"/>
+            </w:pPr>
+            <w:r>
+              <w:t xml:space="preserve">Histórico</w:t>
             </w:r>
           </w:p>
         </w:tc>
@@ -415,21 +438,18 @@
               <w:pStyle w:val="Compact"/>
             </w:pPr>
             <w:r>
-              <w:t xml:space="preserve">Estadísticos robustos</w:t>
-            </w:r>
-          </w:p>
-        </w:tc>
-        <w:tc>
-          <w:tcPr/>
-          <w:p>
-            <w:pPr>
-              <w:pStyle w:val="Compact"/>
-            </w:pPr>
-            <w:r>
-              <w:rPr>
-                <w:rStyle w:val="VerbatimChar"/>
-              </w:rPr>
-              <w:t xml:space="preserve">R/</w:t>
+              <w:t xml:space="preserve">Estadísticos robustos iniciales</w:t>
+            </w:r>
+          </w:p>
+        </w:tc>
+        <w:tc>
+          <w:tcPr/>
+          <w:p>
+            <w:pPr>
+              <w:pStyle w:val="Compact"/>
+            </w:pPr>
+            <w:r>
+              <w:t xml:space="preserve">Histórico</w:t>
             </w:r>
           </w:p>
         </w:tc>
@@ -456,21 +476,18 @@
               <w:pStyle w:val="Compact"/>
             </w:pPr>
             <w:r>
-              <w:t xml:space="preserve">Cálculo de puntajes</w:t>
-            </w:r>
-          </w:p>
-        </w:tc>
-        <w:tc>
-          <w:tcPr/>
-          <w:p>
-            <w:pPr>
-              <w:pStyle w:val="Compact"/>
-            </w:pPr>
-            <w:r>
-              <w:rPr>
-                <w:rStyle w:val="VerbatimChar"/>
-              </w:rPr>
-              <w:t xml:space="preserve">R/</w:t>
+              <w:t xml:space="preserve">Puntajes PT iniciales</w:t>
+            </w:r>
+          </w:p>
+        </w:tc>
+        <w:tc>
+          <w:tcPr/>
+          <w:p>
+            <w:pPr>
+              <w:pStyle w:val="Compact"/>
+            </w:pPr>
+            <w:r>
+              <w:t xml:space="preserve">Histórico</w:t>
             </w:r>
           </w:p>
         </w:tc>
@@ -497,21 +514,18 @@
               <w:pStyle w:val="Compact"/>
             </w:pPr>
             <w:r>
-              <w:t xml:space="preserve">Utilidades</w:t>
-            </w:r>
-          </w:p>
-        </w:tc>
-        <w:tc>
-          <w:tcPr/>
-          <w:p>
-            <w:pPr>
-              <w:pStyle w:val="Compact"/>
-            </w:pPr>
-            <w:r>
-              <w:rPr>
-                <w:rStyle w:val="VerbatimChar"/>
-              </w:rPr>
-              <w:t xml:space="preserve">R/</w:t>
+              <w:t xml:space="preserve">Utilidades iniciales, luego reemplazadas</w:t>
+            </w:r>
+          </w:p>
+        </w:tc>
+        <w:tc>
+          <w:tcPr/>
+          <w:p>
+            <w:pPr>
+              <w:pStyle w:val="Compact"/>
+            </w:pPr>
+            <w:r>
+              <w:t xml:space="preserve">Obsoleto/histórico</w:t>
             </w:r>
           </w:p>
         </w:tc>
@@ -538,10 +552,23 @@
               <w:pStyle w:val="Compact"/>
             </w:pPr>
             <w:r>
-              <w:t xml:space="preserve">Tests de verificación</w:t>
-            </w:r>
-          </w:p>
-        </w:tc>
+              <w:t xml:space="preserve">Comprobación diseñada para el snapshot inicial</w:t>
+            </w:r>
+          </w:p>
+        </w:tc>
+        <w:tc>
+          <w:tcPr/>
+          <w:p>
+            <w:pPr>
+              <w:pStyle w:val="Compact"/>
+            </w:pPr>
+            <w:r>
+              <w:t xml:space="preserve">Evidencia histórica</w:t>
+            </w:r>
+          </w:p>
+        </w:tc>
+      </w:tr>
+      <w:tr>
         <w:tc>
           <w:tcPr/>
           <w:p>
@@ -552,69 +579,46 @@
               <w:rPr>
                 <w:rStyle w:val="VerbatimChar"/>
               </w:rPr>
-              <w:t xml:space="preserve">tests/</w:t>
-            </w:r>
-          </w:p>
-        </w:tc>
-      </w:tr>
-      <w:tr>
-        <w:tc>
-          <w:tcPr/>
-          <w:p>
-            <w:pPr>
-              <w:pStyle w:val="Compact"/>
-            </w:pPr>
-            <w:r>
-              <w:rPr>
-                <w:rStyle w:val="VerbatimChar"/>
-              </w:rPr>
-              <w:t xml:space="preserve">tests/test_01_existencia_archivos.md</w:t>
-            </w:r>
-          </w:p>
-        </w:tc>
-        <w:tc>
-          <w:tcPr/>
-          <w:p>
-            <w:pPr>
-              <w:pStyle w:val="Compact"/>
-            </w:pPr>
-            <w:r>
-              <w:t xml:space="preserve">Guía de uso</w:t>
-            </w:r>
-          </w:p>
-        </w:tc>
-        <w:tc>
-          <w:tcPr/>
-          <w:p>
-            <w:pPr>
-              <w:pStyle w:val="Compact"/>
-            </w:pPr>
-            <w:r>
-              <w:rPr>
-                <w:rStyle w:val="VerbatimChar"/>
-              </w:rPr>
-              <w:t xml:space="preserve">tests/</w:t>
+              <w:t xml:space="preserve">test_01_resultados.csv</w:t>
+            </w:r>
+          </w:p>
+        </w:tc>
+        <w:tc>
+          <w:tcPr/>
+          <w:p>
+            <w:pPr>
+              <w:pStyle w:val="Compact"/>
+            </w:pPr>
+            <w:r>
+              <w:t xml:space="preserve">Resultado conservado de esa comprobación</w:t>
+            </w:r>
+          </w:p>
+        </w:tc>
+        <w:tc>
+          <w:tcPr/>
+          <w:p>
+            <w:pPr>
+              <w:pStyle w:val="Compact"/>
+            </w:pPr>
+            <w:r>
+              <w:t xml:space="preserve">Evidencia histórica</w:t>
             </w:r>
           </w:p>
         </w:tc>
       </w:tr>
     </w:tbl>
-    <w:bookmarkEnd w:id="11"/>
-    <w:bookmarkStart w:id="12" w:name="verificación-de-integridad"/>
     <w:p>
       <w:pPr>
-        <w:pStyle w:val="Heading2"/>
-      </w:pPr>
-      <w:r>
-        <w:t xml:space="preserve">Verificación de Integridad</w:t>
-      </w:r>
-    </w:p>
-    <w:p>
-      <w:pPr>
-        <w:pStyle w:val="FirstParagraph"/>
-      </w:pPr>
-      <w:r>
-        <w:t xml:space="preserve">Todos los archivos han sido verificados para asegurar que son copias idénticas de los originales. El test</w:t>
+        <w:pStyle w:val="BodyText"/>
+      </w:pPr>
+      <w:r>
+        <w:t xml:space="preserve">Los archivos DOCX son derivados de sus fuentes Markdown. El inventario maestro</w:t>
+      </w:r>
+      <w:r>
+        <w:t xml:space="preserve"> </w:t>
+      </w:r>
+      <w:r>
+        <w:t xml:space="preserve">vigente de todo el paquete, con tamaño, estado Git y SHA-256, se encuentra en</w:t>
       </w:r>
       <w:r>
         <w:t xml:space="preserve"> </w:t>
@@ -623,13 +627,138 @@
         <w:rPr>
           <w:rStyle w:val="VerbatimChar"/>
         </w:rPr>
-        <w:t xml:space="preserve">test_01_existencia_archivos.R</w:t>
-      </w:r>
-      <w:r>
-        <w:t xml:space="preserve"> </w:t>
-      </w:r>
-      <w:r>
-        <w:t xml:space="preserve">valida:</w:t>
+        <w:t xml:space="preserve">../00_linea_base/inventario_maestro.csv</w:t>
+      </w:r>
+      <w:r>
+        <w:t xml:space="preserve"> </w:t>
+      </w:r>
+      <w:r>
+        <w:t xml:space="preserve">y se regenera mediante</w:t>
+      </w:r>
+      <w:r>
+        <w:t xml:space="preserve"> </w:t>
+      </w:r>
+      <w:r>
+        <w:rPr>
+          <w:rStyle w:val="VerbatimChar"/>
+        </w:rPr>
+        <w:t xml:space="preserve">scripts/documentacion/generar_inventario_entregables.R</w:t>
+      </w:r>
+      <w:r>
+        <w:t xml:space="preserve"> </w:t>
+      </w:r>
+      <w:r>
+        <w:t xml:space="preserve">desde la raíz.</w:t>
+      </w:r>
+    </w:p>
+    <w:bookmarkEnd w:id="10"/>
+    <w:bookmarkStart w:id="11" w:name="cómo-comprobar-el-paquete-actual"/>
+    <w:p>
+      <w:pPr>
+        <w:pStyle w:val="Heading2"/>
+      </w:pPr>
+      <w:r>
+        <w:t xml:space="preserve">Cómo comprobar el paquete actual</w:t>
+      </w:r>
+    </w:p>
+    <w:p>
+      <w:pPr>
+        <w:pStyle w:val="FirstParagraph"/>
+      </w:pPr>
+      <w:r>
+        <w:t xml:space="preserve">Desde la raíz del repositorio:</w:t>
+      </w:r>
+    </w:p>
+    <w:p>
+      <w:pPr>
+        <w:pStyle w:val="SourceCode"/>
+      </w:pPr>
+      <w:r>
+        <w:rPr>
+          <w:rStyle w:val="NormalTok"/>
+        </w:rPr>
+        <w:t xml:space="preserve">Rscript scripts</w:t>
+      </w:r>
+      <w:r>
+        <w:rPr>
+          <w:rStyle w:val="SpecialCharTok"/>
+        </w:rPr>
+        <w:t xml:space="preserve">/</w:t>
+      </w:r>
+      <w:r>
+        <w:rPr>
+          <w:rStyle w:val="NormalTok"/>
+        </w:rPr>
+        <w:t xml:space="preserve">documentacion</w:t>
+      </w:r>
+      <w:r>
+        <w:rPr>
+          <w:rStyle w:val="SpecialCharTok"/>
+        </w:rPr>
+        <w:t xml:space="preserve">/</w:t>
+      </w:r>
+      <w:r>
+        <w:rPr>
+          <w:rStyle w:val="NormalTok"/>
+        </w:rPr>
+        <w:t xml:space="preserve">generar_inventario_entregables.R</w:t>
+      </w:r>
+      <w:r>
+        <w:br/>
+      </w:r>
+      <w:r>
+        <w:rPr>
+          <w:rStyle w:val="NormalTok"/>
+        </w:rPr>
+        <w:t xml:space="preserve">Rscript </w:t>
+      </w:r>
+      <w:r>
+        <w:rPr>
+          <w:rStyle w:val="SpecialCharTok"/>
+        </w:rPr>
+        <w:t xml:space="preserve">-</w:t>
+      </w:r>
+      <w:r>
+        <w:rPr>
+          <w:rStyle w:val="NormalTok"/>
+        </w:rPr>
+        <w:t xml:space="preserve">e </w:t>
+      </w:r>
+      <w:r>
+        <w:rPr>
+          <w:rStyle w:val="StringTok"/>
+        </w:rPr>
+        <w:t xml:space="preserve">'testthat::test_file("tests/testthat/test-linea-base-entregables.R")'</w:t>
+      </w:r>
+    </w:p>
+    <w:p>
+      <w:pPr>
+        <w:pStyle w:val="FirstParagraph"/>
+      </w:pPr>
+      <w:r>
+        <w:t xml:space="preserve">Esta es la comprobación recomendada. El test incluido dentro de E01 se conserva</w:t>
+      </w:r>
+      <w:r>
+        <w:t xml:space="preserve"> </w:t>
+      </w:r>
+      <w:r>
+        <w:t xml:space="preserve">para auditoría del corte inicial y puede dejar de coincidir con el código</w:t>
+      </w:r>
+      <w:r>
+        <w:t xml:space="preserve"> </w:t>
+      </w:r>
+      <w:r>
+        <w:t xml:space="preserve">vigente precisamente porque el aplicativo evolucionó.</w:t>
+      </w:r>
+    </w:p>
+    <w:bookmarkEnd w:id="11"/>
+    <w:bookmarkStart w:id="12" w:name="cómo-identificar-qué-versión-usar"/>
+    <w:p>
+      <w:pPr>
+        <w:pStyle w:val="Heading2"/>
+      </w:pPr>
+      <w:r>
+        <w:t xml:space="preserve">Cómo identificar qué versión usar</w:t>
       </w:r>
     </w:p>
     <w:p>
@@ -641,7 +770,7 @@
         </w:numPr>
       </w:pPr>
       <w:r>
-        <w:t xml:space="preserve">Existencia de archivos origen en</w:t>
+        <w:t xml:space="preserve">Para operar el aplicativo, use el</w:t>
       </w:r>
       <w:r>
         <w:t xml:space="preserve"> </w:t>
@@ -650,7 +779,13 @@
         <w:rPr>
           <w:rStyle w:val="VerbatimChar"/>
         </w:rPr>
-        <w:t xml:space="preserve">pt_app/</w:t>
+        <w:t xml:space="preserve">app.R</w:t>
+      </w:r>
+      <w:r>
+        <w:t xml:space="preserve"> </w:t>
+      </w:r>
+      <w:r>
+        <w:t xml:space="preserve">de la raíz.</w:t>
       </w:r>
     </w:p>
     <w:p>
@@ -662,7 +797,34 @@
         </w:numPr>
       </w:pPr>
       <w:r>
-        <w:t xml:space="preserve">Correspondencia de hash SHA256 entre original y copia</w:t>
+        <w:t xml:space="preserve">Para cálculos reutilizables, use</w:t>
+      </w:r>
+      <w:r>
+        <w:t xml:space="preserve"> </w:t>
+      </w:r>
+      <w:r>
+        <w:rPr>
+          <w:rStyle w:val="VerbatimChar"/>
+        </w:rPr>
+        <w:t xml:space="preserve">ptcalc/R/</w:t>
+      </w:r>
+      <w:r>
+        <w:t xml:space="preserve"> </w:t>
+      </w:r>
+      <w:r>
+        <w:t xml:space="preserve">mediante</w:t>
+      </w:r>
+      <w:r>
+        <w:t xml:space="preserve"> </w:t>
+      </w:r>
+      <w:r>
+        <w:rPr>
+          <w:rStyle w:val="VerbatimChar"/>
+        </w:rPr>
+        <w:t xml:space="preserve">devtools::load_all("ptcalc")</w:t>
+      </w:r>
+      <w:r>
+        <w:t xml:space="preserve">.</w:t>
       </w:r>
     </w:p>
     <w:p>
@@ -674,71 +836,19 @@
         </w:numPr>
       </w:pPr>
       <w:r>
-        <w:t xml:space="preserve">Validación de sintaxis R básica</w:t>
-      </w:r>
-    </w:p>
-    <w:bookmarkEnd w:id="12"/>
-    <w:bookmarkStart w:id="13" w:name="uso-de-los-tests"/>
-    <w:p>
-      <w:pPr>
-        <w:pStyle w:val="Heading2"/>
-      </w:pPr>
-      <w:r>
-        <w:t xml:space="preserve">Uso de los Tests</w:t>
+        <w:t xml:space="preserve">Para revisar el origen del proyecto, consulte este directorio.</w:t>
       </w:r>
     </w:p>
     <w:p>
       <w:pPr>
-        <w:pStyle w:val="FirstParagraph"/>
-      </w:pPr>
-      <w:r>
-        <w:t xml:space="preserve">Para ejecutar las verificaciones:</w:t>
-      </w:r>
-    </w:p>
-    <w:p>
-      <w:pPr>
-        <w:pStyle w:val="SourceCode"/>
-      </w:pPr>
-      <w:r>
-        <w:rPr>
-          <w:rStyle w:val="CommentTok"/>
-        </w:rPr>
-        <w:t xml:space="preserve"># Desde la raíz del proyecto</w:t>
-      </w:r>
-      <w:r>
-        <w:br/>
-      </w:r>
-      <w:r>
-        <w:rPr>
-          <w:rStyle w:val="FunctionTok"/>
-        </w:rPr>
-        <w:t xml:space="preserve">source</w:t>
-      </w:r>
-      <w:r>
-        <w:rPr>
-          <w:rStyle w:val="NormalTok"/>
-        </w:rPr>
-        <w:t xml:space="preserve">(</w:t>
-      </w:r>
-      <w:r>
-        <w:rPr>
-          <w:rStyle w:val="StringTok"/>
-        </w:rPr>
-        <w:t xml:space="preserve">"Entregables_pt_app/01_repo_inicial/tests/test_01_existencia_archivos.R"</w:t>
-      </w:r>
-      <w:r>
-        <w:rPr>
-          <w:rStyle w:val="NormalTok"/>
-        </w:rPr>
-        <w:t xml:space="preserve">)</w:t>
-      </w:r>
-    </w:p>
-    <w:p>
-      <w:pPr>
-        <w:pStyle w:val="FirstParagraph"/>
-      </w:pPr>
-      <w:r>
-        <w:t xml:space="preserve">Ver el archivo</w:t>
+        <w:pStyle w:val="Compact"/>
+        <w:numPr>
+          <w:ilvl w:val="0"/>
+          <w:numId w:val="1001"/>
+        </w:numPr>
+      </w:pPr>
+      <w:r>
+        <w:t xml:space="preserve">No trate</w:t>
       </w:r>
       <w:r>
         <w:t xml:space="preserve"> </w:t>
@@ -747,53 +857,400 @@
         <w:rPr>
           <w:rStyle w:val="VerbatimChar"/>
         </w:rPr>
-        <w:t xml:space="preserve">tests/test_01_existencia_archivos.md</w:t>
-      </w:r>
-      <w:r>
-        <w:t xml:space="preserve"> </w:t>
-      </w:r>
-      <w:r>
-        <w:t xml:space="preserve">para instrucciones detalladas.</w:t>
+        <w:t xml:space="preserve">app_original.R</w:t>
+      </w:r>
+      <w:r>
+        <w:t xml:space="preserve">,</w:t>
+      </w:r>
+      <w:r>
+        <w:t xml:space="preserve"> </w:t>
+      </w:r>
+      <w:r>
+        <w:rPr>
+          <w:rStyle w:val="VerbatimChar"/>
+        </w:rPr>
+        <w:t xml:space="preserve">app_v06.R</w:t>
+      </w:r>
+      <w:r>
+        <w:t xml:space="preserve">,</w:t>
+      </w:r>
+      <w:r>
+        <w:t xml:space="preserve"> </w:t>
+      </w:r>
+      <w:r>
+        <w:rPr>
+          <w:rStyle w:val="VerbatimChar"/>
+        </w:rPr>
+        <w:t xml:space="preserve">app_v07.R</w:t>
+      </w:r>
+      <w:r>
+        <w:t xml:space="preserve"> </w:t>
+      </w:r>
+      <w:r>
+        <w:t xml:space="preserve">ni</w:t>
+      </w:r>
+      <w:r>
+        <w:t xml:space="preserve"> </w:t>
+      </w:r>
+      <w:r>
+        <w:rPr>
+          <w:rStyle w:val="VerbatimChar"/>
+        </w:rPr>
+        <w:t xml:space="preserve">app_final.R</w:t>
+      </w:r>
+      <w:r>
+        <w:t xml:space="preserve"> </w:t>
+      </w:r>
+      <w:r>
+        <w:t xml:space="preserve">como</w:t>
+      </w:r>
+      <w:r>
+        <w:t xml:space="preserve"> </w:t>
+      </w:r>
+      <w:r>
+        <w:t xml:space="preserve">fuentes vigentes sin contrastarlas con el commit documentado.</w:t>
       </w:r>
     </w:p>
-    <w:bookmarkEnd w:id="13"/>
-    <w:bookmarkStart w:id="14" w:name="próximos-pasos"/>
+    <w:bookmarkEnd w:id="12"/>
+    <w:bookmarkStart w:id="16" w:name="evidencia-visual-vigente"/>
     <w:p>
       <w:pPr>
         <w:pStyle w:val="Heading2"/>
       </w:pPr>
       <w:r>
-        <w:t xml:space="preserve">Próximos Pasos</w:t>
+        <w:t xml:space="preserve">Evidencia visual vigente</w:t>
       </w:r>
     </w:p>
     <w:p>
       <w:pPr>
-        <w:pStyle w:val="FirstParagraph"/>
-      </w:pPr>
-      <w:r>
-        <w:t xml:space="preserve">Este entregable es la línea base. Los siguientes entregables utilizarán este código como referencia para:</w:t>
-      </w:r>
-      <w:r>
-        <w:t xml:space="preserve"> </w:t>
-      </w:r>
-      <w:r>
-        <w:t xml:space="preserve">- Documentar funciones usadas (Entregable 02)</w:t>
-      </w:r>
-      <w:r>
-        <w:t xml:space="preserve"> </w:t>
-      </w:r>
-      <w:r>
-        <w:t xml:space="preserve">- Implementar cálculos standalone (Entregable 03)</w:t>
-      </w:r>
-      <w:r>
-        <w:t xml:space="preserve"> </w:t>
-      </w:r>
-      <w:r>
-        <w:t xml:space="preserve">- Desarrollar módulo de puntajes (Entregable 04)</w:t>
+        <w:pStyle w:val="CaptionedFigure"/>
+      </w:pPr>
+      <w:r>
+        <w:drawing>
+          <wp:inline>
+            <wp:extent cx="5334000" cy="5545137"/>
+            <wp:effectExtent b="0" l="0" r="0" t="0"/>
+            <wp:docPr descr="CAP-01. Inicio del aplicativo y zonas de carga." title="" id="14" name="Picture"/>
+            <a:graphic>
+              <a:graphicData uri="http://schemas.openxmlformats.org/drawingml/2006/picture">
+                <pic:pic>
+                  <pic:nvPicPr>
+                    <pic:cNvPr descr="../00_evidencia_visual/capturas/CAP-01_inicio_carga.png" id="15" name="Picture"/>
+                    <pic:cNvPicPr>
+                      <a:picLocks noChangeArrowheads="1" noChangeAspect="1"/>
+                    </pic:cNvPicPr>
+                  </pic:nvPicPr>
+                  <pic:blipFill>
+                    <a:blip r:embed="rId13"/>
+                    <a:stretch>
+                      <a:fillRect/>
+                    </a:stretch>
+                  </pic:blipFill>
+                  <pic:spPr bwMode="auto">
+                    <a:xfrm>
+                      <a:off x="0" y="0"/>
+                      <a:ext cx="5334000" cy="5545137"/>
+                    </a:xfrm>
+                    <a:prstGeom prst="rect">
+                      <a:avLst/>
+                    </a:prstGeom>
+                    <a:noFill/>
+                    <a:ln w="9525">
+                      <a:noFill/>
+                      <a:headEnd/>
+                      <a:tailEnd/>
+                    </a:ln>
+                  </pic:spPr>
+                </pic:pic>
+              </a:graphicData>
+            </a:graphic>
+          </wp:inline>
+        </w:drawing>
       </w:r>
     </w:p>
-    <w:bookmarkEnd w:id="14"/>
-    <w:bookmarkEnd w:id="15"/>
+    <w:p>
+      <w:pPr>
+        <w:pStyle w:val="ImageCaption"/>
+      </w:pPr>
+      <w:r>
+        <w:t xml:space="preserve">CAP-01. Inicio del aplicativo y zonas de carga.</w:t>
+      </w:r>
+    </w:p>
+    <w:p>
+      <w:pPr>
+        <w:pStyle w:val="BodyText"/>
+      </w:pPr>
+      <w:r>
+        <w:rPr>
+          <w:b/>
+          <w:bCs/>
+        </w:rPr>
+        <w:t xml:space="preserve">Figura CAP-01.</w:t>
+      </w:r>
+      <w:r>
+        <w:t xml:space="preserve"> </w:t>
+      </w:r>
+      <w:r>
+        <w:t xml:space="preserve">Interfaz vigente, no la interfaz del snapshot. Su fecha,</w:t>
+      </w:r>
+      <w:r>
+        <w:t xml:space="preserve"> </w:t>
+      </w:r>
+      <w:r>
+        <w:t xml:space="preserve">commit, datos de demostración y SHA-256 están en</w:t>
+      </w:r>
+      <w:r>
+        <w:t xml:space="preserve"> </w:t>
+      </w:r>
+      <w:r>
+        <w:rPr>
+          <w:rStyle w:val="VerbatimChar"/>
+        </w:rPr>
+        <w:t xml:space="preserve">../00_evidencia_visual/indice_capturas.csv</w:t>
+      </w:r>
+      <w:r>
+        <w:t xml:space="preserve">.</w:t>
+      </w:r>
+    </w:p>
+    <w:bookmarkEnd w:id="16"/>
+    <w:bookmarkStart w:id="17" w:name="trazabilidad-y-límites"/>
+    <w:p>
+      <w:pPr>
+        <w:pStyle w:val="Heading2"/>
+      </w:pPr>
+      <w:r>
+        <w:t xml:space="preserve">Trazabilidad y límites</w:t>
+      </w:r>
+    </w:p>
+    <w:p>
+      <w:pPr>
+        <w:pStyle w:val="Compact"/>
+        <w:numPr>
+          <w:ilvl w:val="0"/>
+          <w:numId w:val="1002"/>
+        </w:numPr>
+      </w:pPr>
+      <w:r>
+        <w:t xml:space="preserve">Línea base funcional:</w:t>
+      </w:r>
+      <w:r>
+        <w:t xml:space="preserve"> </w:t>
+      </w:r>
+      <w:r>
+        <w:rPr>
+          <w:rStyle w:val="VerbatimChar"/>
+        </w:rPr>
+        <w:t xml:space="preserve">../00_linea_base/linea_base_version.md</w:t>
+      </w:r>
+      <w:r>
+        <w:t xml:space="preserve">.</w:t>
+      </w:r>
+    </w:p>
+    <w:p>
+      <w:pPr>
+        <w:pStyle w:val="Compact"/>
+        <w:numPr>
+          <w:ilvl w:val="0"/>
+          <w:numId w:val="1002"/>
+        </w:numPr>
+      </w:pPr>
+      <w:r>
+        <w:t xml:space="preserve">Fuentes autorizadas:</w:t>
+      </w:r>
+      <w:r>
+        <w:t xml:space="preserve"> </w:t>
+      </w:r>
+      <w:r>
+        <w:rPr>
+          <w:rStyle w:val="VerbatimChar"/>
+        </w:rPr>
+        <w:t xml:space="preserve">../00_linea_base/fuentes_y_requisitos.md</w:t>
+      </w:r>
+      <w:r>
+        <w:t xml:space="preserve">.</w:t>
+      </w:r>
+    </w:p>
+    <w:p>
+      <w:pPr>
+        <w:pStyle w:val="Compact"/>
+        <w:numPr>
+          <w:ilvl w:val="0"/>
+          <w:numId w:val="1002"/>
+        </w:numPr>
+      </w:pPr>
+      <w:r>
+        <w:t xml:space="preserve">Inventario completo:</w:t>
+      </w:r>
+      <w:r>
+        <w:t xml:space="preserve"> </w:t>
+      </w:r>
+      <w:r>
+        <w:rPr>
+          <w:rStyle w:val="VerbatimChar"/>
+        </w:rPr>
+        <w:t xml:space="preserve">../00_linea_base/inventario_maestro.csv</w:t>
+      </w:r>
+      <w:r>
+        <w:t xml:space="preserve">.</w:t>
+      </w:r>
+    </w:p>
+    <w:p>
+      <w:pPr>
+        <w:pStyle w:val="Compact"/>
+        <w:numPr>
+          <w:ilvl w:val="0"/>
+          <w:numId w:val="1002"/>
+        </w:numPr>
+      </w:pPr>
+      <w:r>
+        <w:t xml:space="preserve">No se encontró contrato, TDR o acta primaria en el workspace; por ello este</w:t>
+      </w:r>
+      <w:r>
+        <w:t xml:space="preserve"> </w:t>
+      </w:r>
+      <w:r>
+        <w:t xml:space="preserve">documento describe el contenido verificable, pero no certifica por sí solo</w:t>
+      </w:r>
+      <w:r>
+        <w:t xml:space="preserve"> </w:t>
+      </w:r>
+      <w:r>
+        <w:t xml:space="preserve">la aceptación contractual.</w:t>
+      </w:r>
+    </w:p>
+    <w:bookmarkEnd w:id="17"/>
+    <w:bookmarkStart w:id="18" w:name="historial-de-cambios"/>
+    <w:p>
+      <w:pPr>
+        <w:pStyle w:val="Heading2"/>
+      </w:pPr>
+      <w:r>
+        <w:t xml:space="preserve">Historial de cambios</w:t>
+      </w:r>
+    </w:p>
+    <w:tbl>
+      <w:tblPr>
+        <w:tblStyle w:val="Table"/>
+        <w:tblW w:type="pct" w:w="5000"/>
+        <w:tblLayout w:type="fixed"/>
+        <w:tblLook w:firstRow="1" w:lastRow="0" w:firstColumn="0" w:lastColumn="0" w:noHBand="0" w:noVBand="0" w:val="0020"/>
+      </w:tblPr>
+      <w:tblGrid>
+        <w:gridCol w:w="2640"/>
+        <w:gridCol w:w="2640"/>
+        <w:gridCol w:w="2640"/>
+      </w:tblGrid>
+      <w:tr>
+        <w:trPr>
+          <w:tblHeader w:val="on"/>
+        </w:trPr>
+        <w:tc>
+          <w:tcPr/>
+          <w:p>
+            <w:pPr>
+              <w:pStyle w:val="Compact"/>
+            </w:pPr>
+            <w:r>
+              <w:t xml:space="preserve">Versión</w:t>
+            </w:r>
+          </w:p>
+        </w:tc>
+        <w:tc>
+          <w:tcPr/>
+          <w:p>
+            <w:pPr>
+              <w:pStyle w:val="Compact"/>
+            </w:pPr>
+            <w:r>
+              <w:t xml:space="preserve">Fecha</w:t>
+            </w:r>
+          </w:p>
+        </w:tc>
+        <w:tc>
+          <w:tcPr/>
+          <w:p>
+            <w:pPr>
+              <w:pStyle w:val="Compact"/>
+            </w:pPr>
+            <w:r>
+              <w:t xml:space="preserve">Cambio</w:t>
+            </w:r>
+          </w:p>
+        </w:tc>
+      </w:tr>
+      <w:tr>
+        <w:tc>
+          <w:tcPr/>
+          <w:p>
+            <w:pPr>
+              <w:pStyle w:val="Compact"/>
+            </w:pPr>
+            <w:r>
+              <w:t xml:space="preserve">1.0</w:t>
+            </w:r>
+          </w:p>
+        </w:tc>
+        <w:tc>
+          <w:tcPr/>
+          <w:p>
+            <w:pPr>
+              <w:pStyle w:val="Compact"/>
+            </w:pPr>
+            <w:r>
+              <w:t xml:space="preserve">2026-01-24</w:t>
+            </w:r>
+          </w:p>
+        </w:tc>
+        <w:tc>
+          <w:tcPr/>
+          <w:p>
+            <w:pPr>
+              <w:pStyle w:val="Compact"/>
+            </w:pPr>
+            <w:r>
+              <w:t xml:space="preserve">Registro del snapshot inicial</w:t>
+            </w:r>
+          </w:p>
+        </w:tc>
+      </w:tr>
+      <w:tr>
+        <w:tc>
+          <w:tcPr/>
+          <w:p>
+            <w:pPr>
+              <w:pStyle w:val="Compact"/>
+            </w:pPr>
+            <w:r>
+              <w:t xml:space="preserve">2.0</w:t>
+            </w:r>
+          </w:p>
+        </w:tc>
+        <w:tc>
+          <w:tcPr/>
+          <w:p>
+            <w:pPr>
+              <w:pStyle w:val="Compact"/>
+            </w:pPr>
+            <w:r>
+              <w:t xml:space="preserve">2026-07-14</w:t>
+            </w:r>
+          </w:p>
+        </w:tc>
+        <w:tc>
+          <w:tcPr/>
+          <w:p>
+            <w:pPr>
+              <w:pStyle w:val="Compact"/>
+            </w:pPr>
+            <w:r>
+              <w:t xml:space="preserve">Separación explícita entre histórico y vigente; enlace al inventario auditable</w:t>
+            </w:r>
+          </w:p>
+        </w:tc>
+      </w:tr>
+    </w:tbl>
+    <w:bookmarkEnd w:id="18"/>
+    <w:bookmarkEnd w:id="19"/>
     <w:sectPr>
       <w:footnotePr>
         <w:numRestart w:val="eachSect"/>
@@ -987,6 +1444,109 @@
       <w:pPr>
         <w:ind w:left="6480" w:hanging="360"/>
       </w:pPr>
+    </w:lvl>
+  </w:abstractNum>
+  <w:abstractNum w:abstractNumId="991">
+    <w:nsid w:val="0000A991"/>
+    <w:multiLevelType w:val="multilevel"/>
+    <w:lvl w:ilvl="0">
+      <w:numFmt w:val="bullet"/>
+      <w:lvlText w:val=""/>
+      <w:lvlJc w:val="left"/>
+      <w:pPr>
+        <w:ind w:left="720" w:hanging="360"/>
+      </w:pPr>
+      <w:rPr>
+        <w:rFonts w:ascii="Symbol" w:hAnsi="Symbol" w:cs="Symbol" w:hint="default"/>
+      </w:rPr>
+    </w:lvl>
+    <w:lvl w:ilvl="1">
+      <w:numFmt w:val="bullet"/>
+      <w:lvlText w:val="o"/>
+      <w:lvlJc w:val="left"/>
+      <w:pPr>
+        <w:ind w:left="1440" w:hanging="360"/>
+      </w:pPr>
+      <w:rPr>
+        <w:rFonts w:ascii="Courier New" w:hAnsi="Courier New" w:cs="Courier New" w:hint="default"/>
+      </w:rPr>
+    </w:lvl>
+    <w:lvl w:ilvl="2">
+      <w:numFmt w:val="bullet"/>
+      <w:lvlText w:val=""/>
+      <w:lvlJc w:val="left"/>
+      <w:pPr>
+        <w:ind w:left="2160" w:hanging="360"/>
+      </w:pPr>
+      <w:rPr>
+        <w:rFonts w:ascii="Wingdings" w:hAnsi="Wingdings" w:cs="Wingdings" w:hint="default"/>
+      </w:rPr>
+    </w:lvl>
+    <w:lvl w:ilvl="3">
+      <w:numFmt w:val="bullet"/>
+      <w:lvlText w:val=""/>
+      <w:lvlJc w:val="left"/>
+      <w:pPr>
+        <w:ind w:left="2880" w:hanging="360"/>
+      </w:pPr>
+      <w:rPr>
+        <w:rFonts w:ascii="Symbol" w:hAnsi="Symbol" w:cs="Symbol" w:hint="default"/>
+      </w:rPr>
+    </w:lvl>
+    <w:lvl w:ilvl="4">
+      <w:numFmt w:val="bullet"/>
+      <w:lvlText w:val="o"/>
+      <w:lvlJc w:val="left"/>
+      <w:pPr>
+        <w:ind w:left="3600" w:hanging="360"/>
+      </w:pPr>
+      <w:rPr>
+        <w:rFonts w:ascii="Courier New" w:hAnsi="Courier New" w:cs="Courier New" w:hint="default"/>
+      </w:rPr>
+    </w:lvl>
+    <w:lvl w:ilvl="5">
+      <w:numFmt w:val="bullet"/>
+      <w:lvlText w:val=""/>
+      <w:lvlJc w:val="left"/>
+      <w:pPr>
+        <w:ind w:left="4320" w:hanging="360"/>
+      </w:pPr>
+      <w:rPr>
+        <w:rFonts w:ascii="Wingdings" w:hAnsi="Wingdings" w:cs="Wingdings" w:hint="default"/>
+      </w:rPr>
+    </w:lvl>
+    <w:lvl w:ilvl="6">
+      <w:numFmt w:val="bullet"/>
+      <w:lvlText w:val=""/>
+      <w:lvlJc w:val="left"/>
+      <w:pPr>
+        <w:ind w:left="5040" w:hanging="360"/>
+      </w:pPr>
+      <w:rPr>
+        <w:rFonts w:ascii="Symbol" w:hAnsi="Symbol" w:cs="Symbol" w:hint="default"/>
+      </w:rPr>
+    </w:lvl>
+    <w:lvl w:ilvl="7">
+      <w:numFmt w:val="bullet"/>
+      <w:lvlText w:val="o"/>
+      <w:lvlJc w:val="left"/>
+      <w:pPr>
+        <w:ind w:left="5760" w:hanging="360"/>
+      </w:pPr>
+      <w:rPr>
+        <w:rFonts w:ascii="Courier New" w:hAnsi="Courier New" w:cs="Courier New" w:hint="default"/>
+      </w:rPr>
+    </w:lvl>
+    <w:lvl w:ilvl="8">
+      <w:numFmt w:val="bullet"/>
+      <w:lvlText w:val=""/>
+      <w:lvlJc w:val="left"/>
+      <w:pPr>
+        <w:ind w:left="6480" w:hanging="360"/>
+      </w:pPr>
+      <w:rPr>
+        <w:rFonts w:ascii="Wingdings" w:hAnsi="Wingdings" w:cs="Wingdings" w:hint="default"/>
+      </w:rPr>
     </w:lvl>
   </w:abstractNum>
   <w:num w:numId="1000">
@@ -1022,6 +1582,9 @@
       <w:startOverride w:val="1"/>
     </w:lvlOverride>
   </w:num>
+  <w:num w:numId="1002">
+    <w:abstractNumId w:val="991"/>
+  </w:num>
 </w:numbering>
 </file>
 
@@ -1033,7 +1596,7 @@
         <w:rFonts w:asciiTheme="minorHAnsi" w:cstheme="minorBidi" w:eastAsiaTheme="minorEastAsia" w:hAnsiTheme="minorHAnsi"/>
         <w:sz w:val="24"/>
         <w:szCs w:val="24"/>
-        <w:lang w:bidi="ar-SA" w:eastAsia="zh-CN" w:val="en-US"/>
+        <w:lang w:bidi="ar-SA" w:eastAsia="zh-CN" w:val="es-CO"/>
       </w:rPr>
     </w:rPrDefault>
     <w:pPrDefault>
@@ -1681,7 +2244,7 @@
       <w:color w:themeColor="accent1" w:themeShade="BF" w:val="365F91"/>
     </w:rPr>
   </w:style>
-  <w:style w:type="paragraph" w:customStyle="1" w:styleId="SourceCode">
+  <w:style w:customStyle="1" w:styleId="SourceCode" w:type="paragraph">
     <w:name w:val="Source Code"/>
     <w:basedOn w:val="Normal"/>
     <w:link w:val="VerbatimChar"/>
@@ -1689,7 +2252,7 @@
       <w:wordWrap w:val="off"/>
     </w:pPr>
   </w:style>
-  <w:style w:type="character" w:customStyle="1" w:styleId="KeywordTok">
+  <w:style w:customStyle="1" w:styleId="KeywordTok" w:type="character">
     <w:name w:val="KeywordTok"/>
     <w:basedOn w:val="VerbatimChar"/>
     <w:rPr>
@@ -1697,77 +2260,77 @@
       <w:color w:val="007020"/>
     </w:rPr>
   </w:style>
-  <w:style w:type="character" w:customStyle="1" w:styleId="DataTypeTok">
+  <w:style w:customStyle="1" w:styleId="DataTypeTok" w:type="character">
     <w:name w:val="DataTypeTok"/>
     <w:basedOn w:val="VerbatimChar"/>
     <w:rPr>
       <w:color w:val="902000"/>
     </w:rPr>
   </w:style>
-  <w:style w:type="character" w:customStyle="1" w:styleId="DecValTok">
+  <w:style w:customStyle="1" w:styleId="DecValTok" w:type="character">
     <w:name w:val="DecValTok"/>
     <w:basedOn w:val="VerbatimChar"/>
     <w:rPr>
       <w:color w:val="40a070"/>
     </w:rPr>
   </w:style>
-  <w:style w:type="character" w:customStyle="1" w:styleId="BaseNTok">
+  <w:style w:customStyle="1" w:styleId="BaseNTok" w:type="character">
     <w:name w:val="BaseNTok"/>
     <w:basedOn w:val="VerbatimChar"/>
     <w:rPr>
       <w:color w:val="40a070"/>
     </w:rPr>
   </w:style>
-  <w:style w:type="character" w:customStyle="1" w:styleId="FloatTok">
+  <w:style w:customStyle="1" w:styleId="FloatTok" w:type="character">
     <w:name w:val="FloatTok"/>
     <w:basedOn w:val="VerbatimChar"/>
     <w:rPr>
       <w:color w:val="40a070"/>
     </w:rPr>
   </w:style>
-  <w:style w:type="character" w:customStyle="1" w:styleId="ConstantTok">
+  <w:style w:customStyle="1" w:styleId="ConstantTok" w:type="character">
     <w:name w:val="ConstantTok"/>
     <w:basedOn w:val="VerbatimChar"/>
     <w:rPr>
       <w:color w:val="880000"/>
     </w:rPr>
   </w:style>
-  <w:style w:type="character" w:customStyle="1" w:styleId="CharTok">
+  <w:style w:customStyle="1" w:styleId="CharTok" w:type="character">
     <w:name w:val="CharTok"/>
     <w:basedOn w:val="VerbatimChar"/>
     <w:rPr>
       <w:color w:val="4070a0"/>
     </w:rPr>
   </w:style>
-  <w:style w:type="character" w:customStyle="1" w:styleId="SpecialCharTok">
+  <w:style w:customStyle="1" w:styleId="SpecialCharTok" w:type="character">
     <w:name w:val="SpecialCharTok"/>
     <w:basedOn w:val="VerbatimChar"/>
     <w:rPr>
       <w:color w:val="4070a0"/>
     </w:rPr>
   </w:style>
-  <w:style w:type="character" w:customStyle="1" w:styleId="StringTok">
+  <w:style w:customStyle="1" w:styleId="StringTok" w:type="character">
     <w:name w:val="StringTok"/>
     <w:basedOn w:val="VerbatimChar"/>
     <w:rPr>
       <w:color w:val="4070a0"/>
     </w:rPr>
   </w:style>
-  <w:style w:type="character" w:customStyle="1" w:styleId="VerbatimStringTok">
+  <w:style w:customStyle="1" w:styleId="VerbatimStringTok" w:type="character">
     <w:name w:val="VerbatimStringTok"/>
     <w:basedOn w:val="VerbatimChar"/>
     <w:rPr>
       <w:color w:val="4070a0"/>
     </w:rPr>
   </w:style>
-  <w:style w:type="character" w:customStyle="1" w:styleId="SpecialStringTok">
+  <w:style w:customStyle="1" w:styleId="SpecialStringTok" w:type="character">
     <w:name w:val="SpecialStringTok"/>
     <w:basedOn w:val="VerbatimChar"/>
     <w:rPr>
       <w:color w:val="bb6688"/>
     </w:rPr>
   </w:style>
-  <w:style w:type="character" w:customStyle="1" w:styleId="ImportTok">
+  <w:style w:customStyle="1" w:styleId="ImportTok" w:type="character">
     <w:name w:val="ImportTok"/>
     <w:basedOn w:val="VerbatimChar"/>
     <w:rPr>
@@ -1775,7 +2338,7 @@
       <w:color w:val="008000"/>
     </w:rPr>
   </w:style>
-  <w:style w:type="character" w:customStyle="1" w:styleId="CommentTok">
+  <w:style w:customStyle="1" w:styleId="CommentTok" w:type="character">
     <w:name w:val="CommentTok"/>
     <w:basedOn w:val="VerbatimChar"/>
     <w:rPr>
@@ -1783,7 +2346,7 @@
       <w:color w:val="60a0b0"/>
     </w:rPr>
   </w:style>
-  <w:style w:type="character" w:customStyle="1" w:styleId="DocumentationTok">
+  <w:style w:customStyle="1" w:styleId="DocumentationTok" w:type="character">
     <w:name w:val="DocumentationTok"/>
     <w:basedOn w:val="VerbatimChar"/>
     <w:rPr>
@@ -1791,7 +2354,7 @@
       <w:color w:val="ba2121"/>
     </w:rPr>
   </w:style>
-  <w:style w:type="character" w:customStyle="1" w:styleId="AnnotationTok">
+  <w:style w:customStyle="1" w:styleId="AnnotationTok" w:type="character">
     <w:name w:val="AnnotationTok"/>
     <w:basedOn w:val="VerbatimChar"/>
     <w:rPr>
@@ -1800,7 +2363,7 @@
       <w:color w:val="60a0b0"/>
     </w:rPr>
   </w:style>
-  <w:style w:type="character" w:customStyle="1" w:styleId="CommentVarTok">
+  <w:style w:customStyle="1" w:styleId="CommentVarTok" w:type="character">
     <w:name w:val="CommentVarTok"/>
     <w:basedOn w:val="VerbatimChar"/>
     <w:rPr>
@@ -1809,28 +2372,28 @@
       <w:color w:val="60a0b0"/>
     </w:rPr>
   </w:style>
-  <w:style w:type="character" w:customStyle="1" w:styleId="OtherTok">
+  <w:style w:customStyle="1" w:styleId="OtherTok" w:type="character">
     <w:name w:val="OtherTok"/>
     <w:basedOn w:val="VerbatimChar"/>
     <w:rPr>
       <w:color w:val="007020"/>
     </w:rPr>
   </w:style>
-  <w:style w:type="character" w:customStyle="1" w:styleId="FunctionTok">
+  <w:style w:customStyle="1" w:styleId="FunctionTok" w:type="character">
     <w:name w:val="FunctionTok"/>
     <w:basedOn w:val="VerbatimChar"/>
     <w:rPr>
       <w:color w:val="06287e"/>
     </w:rPr>
   </w:style>
-  <w:style w:type="character" w:customStyle="1" w:styleId="VariableTok">
+  <w:style w:customStyle="1" w:styleId="VariableTok" w:type="character">
     <w:name w:val="VariableTok"/>
     <w:basedOn w:val="VerbatimChar"/>
     <w:rPr>
       <w:color w:val="19177c"/>
     </w:rPr>
   </w:style>
-  <w:style w:type="character" w:customStyle="1" w:styleId="ControlFlowTok">
+  <w:style w:customStyle="1" w:styleId="ControlFlowTok" w:type="character">
     <w:name w:val="ControlFlowTok"/>
     <w:basedOn w:val="VerbatimChar"/>
     <w:rPr>
@@ -1838,45 +2401,45 @@
       <w:color w:val="007020"/>
     </w:rPr>
   </w:style>
-  <w:style w:type="character" w:customStyle="1" w:styleId="OperatorTok">
+  <w:style w:customStyle="1" w:styleId="OperatorTok" w:type="character">
     <w:name w:val="OperatorTok"/>
     <w:basedOn w:val="VerbatimChar"/>
     <w:rPr>
       <w:color w:val="666666"/>
     </w:rPr>
   </w:style>
-  <w:style w:type="character" w:customStyle="1" w:styleId="BuiltInTok">
+  <w:style w:customStyle="1" w:styleId="BuiltInTok" w:type="character">
     <w:name w:val="BuiltInTok"/>
     <w:basedOn w:val="VerbatimChar"/>
     <w:rPr>
       <w:color w:val="008000"/>
     </w:rPr>
   </w:style>
-  <w:style w:type="character" w:customStyle="1" w:styleId="ExtensionTok">
+  <w:style w:customStyle="1" w:styleId="ExtensionTok" w:type="character">
     <w:name w:val="ExtensionTok"/>
     <w:basedOn w:val="VerbatimChar"/>
     <w:rPr/>
   </w:style>
-  <w:style w:type="character" w:customStyle="1" w:styleId="PreprocessorTok">
+  <w:style w:customStyle="1" w:styleId="PreprocessorTok" w:type="character">
     <w:name w:val="PreprocessorTok"/>
     <w:basedOn w:val="VerbatimChar"/>
     <w:rPr>
       <w:color w:val="bc7a00"/>
     </w:rPr>
   </w:style>
-  <w:style w:type="character" w:customStyle="1" w:styleId="AttributeTok">
+  <w:style w:customStyle="1" w:styleId="AttributeTok" w:type="character">
     <w:name w:val="AttributeTok"/>
     <w:basedOn w:val="VerbatimChar"/>
     <w:rPr>
       <w:color w:val="7d9029"/>
     </w:rPr>
   </w:style>
-  <w:style w:type="character" w:customStyle="1" w:styleId="RegionMarkerTok">
+  <w:style w:customStyle="1" w:styleId="RegionMarkerTok" w:type="character">
     <w:name w:val="RegionMarkerTok"/>
     <w:basedOn w:val="VerbatimChar"/>
     <w:rPr/>
   </w:style>
-  <w:style w:type="character" w:customStyle="1" w:styleId="InformationTok">
+  <w:style w:customStyle="1" w:styleId="InformationTok" w:type="character">
     <w:name w:val="InformationTok"/>
     <w:basedOn w:val="VerbatimChar"/>
     <w:rPr>
@@ -1885,7 +2448,7 @@
       <w:color w:val="60a0b0"/>
     </w:rPr>
   </w:style>
-  <w:style w:type="character" w:customStyle="1" w:styleId="WarningTok">
+  <w:style w:customStyle="1" w:styleId="WarningTok" w:type="character">
     <w:name w:val="WarningTok"/>
     <w:basedOn w:val="VerbatimChar"/>
     <w:rPr>
@@ -1894,7 +2457,7 @@
       <w:color w:val="60a0b0"/>
     </w:rPr>
   </w:style>
-  <w:style w:type="character" w:customStyle="1" w:styleId="AlertTok">
+  <w:style w:customStyle="1" w:styleId="AlertTok" w:type="character">
     <w:name w:val="AlertTok"/>
     <w:basedOn w:val="VerbatimChar"/>
     <w:rPr>
@@ -1902,7 +2465,7 @@
       <w:color w:val="ff0000"/>
     </w:rPr>
   </w:style>
-  <w:style w:type="character" w:customStyle="1" w:styleId="ErrorTok">
+  <w:style w:customStyle="1" w:styleId="ErrorTok" w:type="character">
     <w:name w:val="ErrorTok"/>
     <w:basedOn w:val="VerbatimChar"/>
     <w:rPr>
@@ -1910,7 +2473,7 @@
       <w:color w:val="ff0000"/>
     </w:rPr>
   </w:style>
-  <w:style w:type="character" w:customStyle="1" w:styleId="NormalTok">
+  <w:style w:customStyle="1" w:styleId="NormalTok" w:type="character">
     <w:name w:val="NormalTok"/>
     <w:basedOn w:val="VerbatimChar"/>
     <w:rPr/>

</xml_diff>